<commit_message>
Initial repository with data and analysis scripts
</commit_message>
<xml_diff>
--- a/tables/ANOVA_F_P_tables.docx
+++ b/tables/ANOVA_F_P_tables.docx
@@ -447,7 +447,7 @@
                 <w:szCs w:val="22"/>
                 <w:color w:val="000000"/>
               </w:rPr>
-              <w:t xml:space="preserve">4.664</w:t>
+              <w:t xml:space="preserve">4.452</w:t>
             </w:r>
           </w:p>
         </w:tc>
@@ -499,7 +499,7 @@
                 <w:szCs w:val="22"/>
                 <w:color w:val="000000"/>
               </w:rPr>
-              <w:t xml:space="preserve">0.0363</w:t>
+              <w:t xml:space="preserve">0.0407</w:t>
             </w:r>
           </w:p>
         </w:tc>
@@ -661,7 +661,7 @@
                 <w:szCs w:val="22"/>
                 <w:color w:val="000000"/>
               </w:rPr>
-              <w:t xml:space="preserve">Sdt_DD</w:t>
+              <w:t xml:space="preserve">DSI</w:t>
             </w:r>
           </w:p>
         </w:tc>
@@ -713,7 +713,7 @@
                 <w:szCs w:val="22"/>
                 <w:color w:val="000000"/>
               </w:rPr>
-              <w:t xml:space="preserve">8.455</w:t>
+              <w:t xml:space="preserve">7.647</w:t>
             </w:r>
           </w:p>
         </w:tc>
@@ -765,7 +765,7 @@
                 <w:szCs w:val="22"/>
                 <w:color w:val="000000"/>
               </w:rPr>
-              <w:t xml:space="preserve">0.0057</w:t>
+              <w:t xml:space="preserve">0.0083</w:t>
             </w:r>
           </w:p>
         </w:tc>
@@ -927,7 +927,7 @@
                 <w:szCs w:val="22"/>
                 <w:color w:val="000000"/>
               </w:rPr>
-              <w:t xml:space="preserve">Cumul_N:Sdt_DD</w:t>
+              <w:t xml:space="preserve">Cumul_N:DSI</w:t>
             </w:r>
           </w:p>
         </w:tc>
@@ -979,7 +979,7 @@
                 <w:szCs w:val="22"/>
                 <w:color w:val="000000"/>
               </w:rPr>
-              <w:t xml:space="preserve">3.127</w:t>
+              <w:t xml:space="preserve">3.565</w:t>
             </w:r>
           </w:p>
         </w:tc>
@@ -1031,7 +1031,7 @@
                 <w:szCs w:val="22"/>
                 <w:color w:val="000000"/>
               </w:rPr>
-              <w:t xml:space="preserve">0.0839</w:t>
+              <w:t xml:space="preserve">0.0658</w:t>
             </w:r>
           </w:p>
         </w:tc>
@@ -1511,7 +1511,7 @@
                 <w:szCs w:val="22"/>
                 <w:color w:val="000000"/>
               </w:rPr>
-              <w:t xml:space="preserve">8.364</w:t>
+              <w:t xml:space="preserve">8.310</w:t>
             </w:r>
           </w:p>
         </w:tc>
@@ -1563,7 +1563,7 @@
                 <w:szCs w:val="22"/>
                 <w:color w:val="000000"/>
               </w:rPr>
-              <w:t xml:space="preserve">0.0059</w:t>
+              <w:t xml:space="preserve">0.0061</w:t>
             </w:r>
           </w:p>
         </w:tc>
@@ -1725,7 +1725,7 @@
                 <w:szCs w:val="22"/>
                 <w:color w:val="000000"/>
               </w:rPr>
-              <w:t xml:space="preserve">Sdt_DD</w:t>
+              <w:t xml:space="preserve">DSI</w:t>
             </w:r>
           </w:p>
         </w:tc>
@@ -1777,7 +1777,7 @@
                 <w:szCs w:val="22"/>
                 <w:color w:val="000000"/>
               </w:rPr>
-              <w:t xml:space="preserve">1.762</w:t>
+              <w:t xml:space="preserve">1.512</w:t>
             </w:r>
           </w:p>
         </w:tc>
@@ -1829,7 +1829,7 @@
                 <w:szCs w:val="22"/>
                 <w:color w:val="000000"/>
               </w:rPr>
-              <w:t xml:space="preserve">0.1912</w:t>
+              <w:t xml:space="preserve">0.2255</w:t>
             </w:r>
           </w:p>
         </w:tc>
@@ -1991,7 +1991,7 @@
                 <w:szCs w:val="22"/>
                 <w:color w:val="000000"/>
               </w:rPr>
-              <w:t xml:space="preserve">Cumul_N:Sdt_DD</w:t>
+              <w:t xml:space="preserve">Cumul_N:DSI</w:t>
             </w:r>
           </w:p>
         </w:tc>
@@ -2043,7 +2043,7 @@
                 <w:szCs w:val="22"/>
                 <w:color w:val="000000"/>
               </w:rPr>
-              <w:t xml:space="preserve">5.583</w:t>
+              <w:t xml:space="preserve">5.309</w:t>
             </w:r>
           </w:p>
         </w:tc>
@@ -2095,7 +2095,7 @@
                 <w:szCs w:val="22"/>
                 <w:color w:val="000000"/>
               </w:rPr>
-              <w:t xml:space="preserve">0.0226</w:t>
+              <w:t xml:space="preserve">0.0261</w:t>
             </w:r>
           </w:p>
         </w:tc>
@@ -2575,7 +2575,7 @@
                 <w:szCs w:val="22"/>
                 <w:color w:val="000000"/>
               </w:rPr>
-              <w:t xml:space="preserve">0.617</w:t>
+              <w:t xml:space="preserve">0.493</w:t>
             </w:r>
           </w:p>
         </w:tc>
@@ -2627,7 +2627,7 @@
                 <w:szCs w:val="22"/>
                 <w:color w:val="000000"/>
               </w:rPr>
-              <w:t xml:space="preserve">0.4363</w:t>
+              <w:t xml:space="preserve">0.4865</w:t>
             </w:r>
           </w:p>
         </w:tc>
@@ -2789,7 +2789,7 @@
                 <w:szCs w:val="22"/>
                 <w:color w:val="000000"/>
               </w:rPr>
-              <w:t xml:space="preserve">Sdt_DD</w:t>
+              <w:t xml:space="preserve">DSI</w:t>
             </w:r>
           </w:p>
         </w:tc>
@@ -2841,7 +2841,7 @@
                 <w:szCs w:val="22"/>
                 <w:color w:val="000000"/>
               </w:rPr>
-              <w:t xml:space="preserve">0.931</w:t>
+              <w:t xml:space="preserve">1.070</w:t>
             </w:r>
           </w:p>
         </w:tc>
@@ -2893,7 +2893,7 @@
                 <w:szCs w:val="22"/>
                 <w:color w:val="000000"/>
               </w:rPr>
-              <w:t xml:space="preserve">0.3398</w:t>
+              <w:t xml:space="preserve">0.3066</w:t>
             </w:r>
           </w:p>
         </w:tc>
@@ -3055,7 +3055,7 @@
                 <w:szCs w:val="22"/>
                 <w:color w:val="000000"/>
               </w:rPr>
-              <w:t xml:space="preserve">Cumul_N:Sdt_DD</w:t>
+              <w:t xml:space="preserve">Cumul_N:DSI</w:t>
             </w:r>
           </w:p>
         </w:tc>
@@ -3107,7 +3107,7 @@
                 <w:szCs w:val="22"/>
                 <w:color w:val="000000"/>
               </w:rPr>
-              <w:t xml:space="preserve">1.104</w:t>
+              <w:t xml:space="preserve">0.900</w:t>
             </w:r>
           </w:p>
         </w:tc>
@@ -3159,7 +3159,7 @@
                 <w:szCs w:val="22"/>
                 <w:color w:val="000000"/>
               </w:rPr>
-              <w:t xml:space="preserve">0.2991</w:t>
+              <w:t xml:space="preserve">0.3481</w:t>
             </w:r>
           </w:p>
         </w:tc>
@@ -3639,7 +3639,7 @@
                 <w:szCs w:val="22"/>
                 <w:color w:val="000000"/>
               </w:rPr>
-              <w:t xml:space="preserve">13.626</w:t>
+              <w:t xml:space="preserve">16.532</w:t>
             </w:r>
           </w:p>
         </w:tc>
@@ -3691,7 +3691,7 @@
                 <w:szCs w:val="22"/>
                 <w:color w:val="000000"/>
               </w:rPr>
-              <w:t xml:space="preserve">0.0006</w:t>
+              <w:t xml:space="preserve">0.0002</w:t>
             </w:r>
           </w:p>
         </w:tc>
@@ -3853,7 +3853,7 @@
                 <w:szCs w:val="22"/>
                 <w:color w:val="000000"/>
               </w:rPr>
-              <w:t xml:space="preserve">Sdt_DD</w:t>
+              <w:t xml:space="preserve">DSI</w:t>
             </w:r>
           </w:p>
         </w:tc>
@@ -3905,7 +3905,7 @@
                 <w:szCs w:val="22"/>
                 <w:color w:val="000000"/>
               </w:rPr>
-              <w:t xml:space="preserve">2.853</w:t>
+              <w:t xml:space="preserve">7.410</w:t>
             </w:r>
           </w:p>
         </w:tc>
@@ -3957,7 +3957,7 @@
                 <w:szCs w:val="22"/>
                 <w:color w:val="000000"/>
               </w:rPr>
-              <w:t xml:space="preserve">0.0983</w:t>
+              <w:t xml:space="preserve">0.0093</w:t>
             </w:r>
           </w:p>
         </w:tc>
@@ -4009,7 +4009,7 @@
                 <w:szCs w:val="22"/>
                 <w:color w:val="000000"/>
               </w:rPr>
-              <w:t xml:space="preserve"/>
+              <w:t xml:space="preserve">**</w:t>
             </w:r>
           </w:p>
         </w:tc>
@@ -4119,7 +4119,7 @@
                 <w:szCs w:val="22"/>
                 <w:color w:val="000000"/>
               </w:rPr>
-              <w:t xml:space="preserve">Cumul_N:Sdt_DD</w:t>
+              <w:t xml:space="preserve">Cumul_N:DSI</w:t>
             </w:r>
           </w:p>
         </w:tc>
@@ -4171,7 +4171,7 @@
                 <w:szCs w:val="22"/>
                 <w:color w:val="000000"/>
               </w:rPr>
-              <w:t xml:space="preserve">4.895</w:t>
+              <w:t xml:space="preserve">5.550</w:t>
             </w:r>
           </w:p>
         </w:tc>
@@ -4223,7 +4223,7 @@
                 <w:szCs w:val="22"/>
                 <w:color w:val="000000"/>
               </w:rPr>
-              <w:t xml:space="preserve">0.0322</w:t>
+              <w:t xml:space="preserve">0.0231</w:t>
             </w:r>
           </w:p>
         </w:tc>

</xml_diff>